<commit_message>
Add mobile and simulation evidence to the testing report
Convert the exploratory screenshots to PNG, annex the 390x844
pass and simulation detail, and note that Chrome translate was
not a product inventory bug.

Co-authored-by: David Ramirez <davidrgj@users.noreply.github.com>
</commit_message>
<xml_diff>
--- a/docs/Informe_pruebas_software_Bienestar_ICA.docx
+++ b/docs/Informe_pruebas_software_Bienestar_ICA.docx
@@ -5187,7 +5187,7 @@
                 <w:b w:val="0"/>
                 <w:sz w:val="20"/>
               </w:rPr>
-              <w:t>Faltan CSP, X-Frame-Options, Referrer-Policy y X-Content-Type-Options en el frontend.</w:t>
+              <w:t>Faltaban X-Frame-Options, nosniff y Referrer-Policy. CSP no se forzó para no romper Angular.</w:t>
             </w:r>
           </w:p>
         </w:tc>
@@ -5202,7 +5202,7 @@
                 <w:b w:val="0"/>
                 <w:sz w:val="20"/>
               </w:rPr>
-              <w:t>Abierto (headers de Vercel)</w:t>
+              <w:t>Headers añadidos en vercel.json; falta deploy</w:t>
             </w:r>
           </w:p>
         </w:tc>
@@ -5554,7 +5554,7 @@
                 <w:b w:val="0"/>
                 <w:sz w:val="20"/>
               </w:rPr>
-              <w:t>Login, registro, tablero, predios, alta predio, animales, alta animal (porcino), reportes, usuarios, simulación, cuenta</w:t>
+              <w:t>Login, registro, tablero, predios, alta predio, animales, detalle, evaluación ICA, alta animal (porcino), reportes, usuarios, simulación y detalle, cuenta; login+tablero en 390×844</w:t>
             </w:r>
           </w:p>
         </w:tc>
@@ -5736,7 +5736,7 @@
           <w:b w:val="0"/>
           <w:sz w:val="22"/>
         </w:rPr>
-        <w:t>Recomendaciones, en orden: 1) publicar el arreglo de logout; 2) añadir CSP y X-Frame-Options en vercel.json; 3) traducir OK/Cancel del ion-select o usar interface action-sheet; 4) quitar el hint de credenciales demo si el entorno deja de ser prototipo; 5) registrar E2E_EMAIL y E2E_PASSWORD como secrets de GitHub para correr Playwright en CI.</w:t>
+        <w:t>Recomendaciones, en orden: 1) publicar el arreglo de logout y los headers de vercel.json; 2) valorar un CSP explícito cuando se pueda probar sin romper Ionic; 3) traducir OK/Cancel del ion-select o usar interface action-sheet; 4) quitar el hint de credenciales demo si el entorno deja de ser prototipo; 5) registrar E2E_EMAIL y E2E_PASSWORD como secrets de GitHub para correr Playwright en CI.</w:t>
       </w:r>
     </w:p>
     <w:p>
@@ -6133,6 +6133,223 @@
       </w:r>
     </w:p>
     <w:p>
+      <w:r>
+        <w:drawing>
+          <wp:inline xmlns:a="http://schemas.openxmlformats.org/drawingml/2006/main" xmlns:pic="http://schemas.openxmlformats.org/drawingml/2006/picture">
+            <wp:extent cx="5669280" cy="3543300"/>
+            <wp:docPr id="13" name="Picture 13"/>
+            <wp:cNvGraphicFramePr>
+              <a:graphicFrameLocks noChangeAspect="1"/>
+            </wp:cNvGraphicFramePr>
+            <a:graphic>
+              <a:graphicData uri="http://schemas.openxmlformats.org/drawingml/2006/picture">
+                <pic:pic>
+                  <pic:nvPicPr>
+                    <pic:cNvPr id="0" name="10-welfare-evaluation-form.png"/>
+                    <pic:cNvPicPr/>
+                  </pic:nvPicPr>
+                  <pic:blipFill>
+                    <a:blip r:embed="rId19"/>
+                    <a:stretch>
+                      <a:fillRect/>
+                    </a:stretch>
+                  </pic:blipFill>
+                  <pic:spPr>
+                    <a:xfrm>
+                      <a:off x="0" y="0"/>
+                      <a:ext cx="5669280" cy="3543300"/>
+                    </a:xfrm>
+                    <a:prstGeom prst="rect"/>
+                  </pic:spPr>
+                </pic:pic>
+              </a:graphicData>
+            </a:graphic>
+          </wp:inline>
+        </w:drawing>
+      </w:r>
+    </w:p>
+    <w:p>
+      <w:pPr>
+        <w:spacing w:after="280"/>
+        <w:jc w:val="center"/>
+      </w:pPr>
+      <w:r>
+        <w:rPr>
+          <w:rFonts w:ascii="Calibri" w:hAnsi="Calibri" w:eastAsia="Calibri"/>
+          <w:b w:val="0"/>
+          <w:i/>
+          <w:sz w:val="18"/>
+        </w:rPr>
+        <w:t>Figura 13. Formulario de evaluación ICA (cinco libertades).</w:t>
+      </w:r>
+    </w:p>
+    <w:p>
+      <w:r>
+        <w:drawing>
+          <wp:inline xmlns:a="http://schemas.openxmlformats.org/drawingml/2006/main" xmlns:pic="http://schemas.openxmlformats.org/drawingml/2006/picture">
+            <wp:extent cx="5669280" cy="3543300"/>
+            <wp:docPr id="14" name="Picture 14"/>
+            <wp:cNvGraphicFramePr>
+              <a:graphicFrameLocks noChangeAspect="1"/>
+            </wp:cNvGraphicFramePr>
+            <a:graphic>
+              <a:graphicData uri="http://schemas.openxmlformats.org/drawingml/2006/picture">
+                <pic:pic>
+                  <pic:nvPicPr>
+                    <pic:cNvPr id="0" name="12-simulation-detail.png"/>
+                    <pic:cNvPicPr/>
+                  </pic:nvPicPr>
+                  <pic:blipFill>
+                    <a:blip r:embed="rId20"/>
+                    <a:stretch>
+                      <a:fillRect/>
+                    </a:stretch>
+                  </pic:blipFill>
+                  <pic:spPr>
+                    <a:xfrm>
+                      <a:off x="0" y="0"/>
+                      <a:ext cx="5669280" cy="3543300"/>
+                    </a:xfrm>
+                    <a:prstGeom prst="rect"/>
+                  </pic:spPr>
+                </pic:pic>
+              </a:graphicData>
+            </a:graphic>
+          </wp:inline>
+        </w:drawing>
+      </w:r>
+    </w:p>
+    <w:p>
+      <w:pPr>
+        <w:spacing w:after="280"/>
+        <w:jc w:val="center"/>
+      </w:pPr>
+      <w:r>
+        <w:rPr>
+          <w:rFonts w:ascii="Calibri" w:hAnsi="Calibri" w:eastAsia="Calibri"/>
+          <w:b w:val="0"/>
+          <w:i/>
+          <w:sz w:val="18"/>
+        </w:rPr>
+        <w:t>Figura 14. Detalle de simulación: peso 125.3 kg, IBA proyectado 68.2 (sesión exploratoria; el navegador tenía traductor activo, el copy original es español).</w:t>
+      </w:r>
+    </w:p>
+    <w:p>
+      <w:r>
+        <w:drawing>
+          <wp:inline xmlns:a="http://schemas.openxmlformats.org/drawingml/2006/main" xmlns:pic="http://schemas.openxmlformats.org/drawingml/2006/picture">
+            <wp:extent cx="5669280" cy="3543300"/>
+            <wp:docPr id="15" name="Picture 15"/>
+            <wp:cNvGraphicFramePr>
+              <a:graphicFrameLocks noChangeAspect="1"/>
+            </wp:cNvGraphicFramePr>
+            <a:graphic>
+              <a:graphicData uri="http://schemas.openxmlformats.org/drawingml/2006/picture">
+                <pic:pic>
+                  <pic:nvPicPr>
+                    <pic:cNvPr id="0" name="19-mobile-login-390x844.png"/>
+                    <pic:cNvPicPr/>
+                  </pic:nvPicPr>
+                  <pic:blipFill>
+                    <a:blip r:embed="rId21"/>
+                    <a:stretch>
+                      <a:fillRect/>
+                    </a:stretch>
+                  </pic:blipFill>
+                  <pic:spPr>
+                    <a:xfrm>
+                      <a:off x="0" y="0"/>
+                      <a:ext cx="5669280" cy="3543300"/>
+                    </a:xfrm>
+                    <a:prstGeom prst="rect"/>
+                  </pic:spPr>
+                </pic:pic>
+              </a:graphicData>
+            </a:graphic>
+          </wp:inline>
+        </w:drawing>
+      </w:r>
+    </w:p>
+    <w:p>
+      <w:pPr>
+        <w:spacing w:after="280"/>
+        <w:jc w:val="center"/>
+      </w:pPr>
+      <w:r>
+        <w:rPr>
+          <w:rFonts w:ascii="Calibri" w:hAnsi="Calibri" w:eastAsia="Calibri"/>
+          <w:b w:val="0"/>
+          <w:i/>
+          <w:sz w:val="18"/>
+        </w:rPr>
+        <w:t>Figura 15. Login en viewport 390×844.</w:t>
+      </w:r>
+    </w:p>
+    <w:p>
+      <w:r>
+        <w:drawing>
+          <wp:inline xmlns:a="http://schemas.openxmlformats.org/drawingml/2006/main" xmlns:pic="http://schemas.openxmlformats.org/drawingml/2006/picture">
+            <wp:extent cx="5669280" cy="3543300"/>
+            <wp:docPr id="16" name="Picture 16"/>
+            <wp:cNvGraphicFramePr>
+              <a:graphicFrameLocks noChangeAspect="1"/>
+            </wp:cNvGraphicFramePr>
+            <a:graphic>
+              <a:graphicData uri="http://schemas.openxmlformats.org/drawingml/2006/picture">
+                <pic:pic>
+                  <pic:nvPicPr>
+                    <pic:cNvPr id="0" name="20-mobile-dashboard-390x844.png"/>
+                    <pic:cNvPicPr/>
+                  </pic:nvPicPr>
+                  <pic:blipFill>
+                    <a:blip r:embed="rId22"/>
+                    <a:stretch>
+                      <a:fillRect/>
+                    </a:stretch>
+                  </pic:blipFill>
+                  <pic:spPr>
+                    <a:xfrm>
+                      <a:off x="0" y="0"/>
+                      <a:ext cx="5669280" cy="3543300"/>
+                    </a:xfrm>
+                    <a:prstGeom prst="rect"/>
+                  </pic:spPr>
+                </pic:pic>
+              </a:graphicData>
+            </a:graphic>
+          </wp:inline>
+        </w:drawing>
+      </w:r>
+    </w:p>
+    <w:p>
+      <w:pPr>
+        <w:spacing w:after="280"/>
+        <w:jc w:val="center"/>
+      </w:pPr>
+      <w:r>
+        <w:rPr>
+          <w:rFonts w:ascii="Calibri" w:hAnsi="Calibri" w:eastAsia="Calibri"/>
+          <w:b w:val="0"/>
+          <w:i/>
+          <w:sz w:val="18"/>
+        </w:rPr>
+        <w:t>Figura 16. Tablero móvil: IBA 81.4, VACA-087 en riesgo, sentence case en español.</w:t>
+      </w:r>
+    </w:p>
+    <w:p>
+      <w:pPr>
+        <w:spacing w:after="160"/>
+      </w:pPr>
+      <w:r>
+        <w:rPr>
+          <w:rFonts w:ascii="Calibri" w:hAnsi="Calibri" w:eastAsia="Calibri"/>
+          <w:b w:val="0"/>
+          <w:sz w:val="22"/>
+        </w:rPr>
+        <w:t>Nota sobre evidencias exploratorias: una pasada manual en Chrome activó el traductor automático (El Recuerdo → The Memory, 3 predios → «0 properties»). Eso no es un defecto del producto. Playwright sin traductor muestra «3 predios», «4 usuarios» y los nombres en español. Los conteos del DOM coinciden con {{ farms.length }} / {{ animals.length }} / {{ users.length }}.</w:t>
+      </w:r>
+    </w:p>
+    <w:p>
       <w:pPr>
         <w:spacing w:after="0"/>
         <w:jc w:val="center"/>

</xml_diff>

<commit_message>
Harden login, storage and security headers
Remove demo credentials from the login UI, serve welfare photos with signed URLs against a private bucket, and add CSP plus Permissions-Policy so DEF-03–DEF-05 close with the earlier logout and ion-select fixes.

Co-authored-by: David Ramirez <davidrgj@users.noreply.github.com>
</commit_message>
<xml_diff>
--- a/docs/Informe_pruebas_software_Bienestar_ICA.docx
+++ b/docs/Informe_pruebas_software_Bienestar_ICA.docx
@@ -6141,7 +6141,7 @@
                 <w:b w:val="0"/>
                 <w:sz w:val="20"/>
               </w:rPr>
-              <w:t>Faltaban cabeceras X-Frame-Options / nosniff / Referrer-Policy.</w:t>
+              <w:t>Faltaban cabeceras de seguridad (frame, nosniff, referrer, CSP).</w:t>
             </w:r>
           </w:p>
         </w:tc>
@@ -6156,7 +6156,7 @@
                 <w:b w:val="0"/>
                 <w:sz w:val="20"/>
               </w:rPr>
-              <w:t>Cerrado en producción; CSP no impuesto</w:t>
+              <w:t>Cerrado: headers + CSP + Permissions-Policy en vercel.json</w:t>
             </w:r>
           </w:p>
         </w:tc>
@@ -6218,7 +6218,7 @@
                 <w:b w:val="0"/>
                 <w:sz w:val="20"/>
               </w:rPr>
-              <w:t>Riesgo residual de prototipo</w:t>
+              <w:t>Cerrado: bucket privado + URLs firmadas; aplicar supabase/harden-storage.sql</w:t>
             </w:r>
           </w:p>
         </w:tc>
@@ -6280,7 +6280,7 @@
                 <w:b w:val="0"/>
                 <w:sz w:val="20"/>
               </w:rPr>
-              <w:t>Riesgo residual de prototipo</w:t>
+              <w:t>Cerrado: sin hint ni campos prellenados</w:t>
             </w:r>
           </w:p>
         </w:tc>
@@ -6297,7 +6297,7 @@
           <w:b w:val="0"/>
           <w:sz w:val="22"/>
         </w:rPr>
-        <w:t>DEF-01 quedó cerrado al publicar await supabase().auth.signOut(), el flag sessionCleared (restore() no rehidrata durante el cierre) y al reejecutar Playwright sobre el alias productivo.</w:t>
+        <w:t>DEF-01 quedó cerrado con await signOut y sessionCleared. DEF-02 con okText/cancelText en español. DEF-03 con CSP y Permissions-Policy. DEF-04 con createSignedUrl y bucket no público. DEF-05 retirando el copy Demo del login.</w:t>
       </w:r>
     </w:p>
     <w:p>
@@ -6540,7 +6540,7 @@
                 <w:b w:val="0"/>
                 <w:sz w:val="20"/>
               </w:rPr>
-              <w:t>2 (bucket público; credenciales demo)</w:t>
+              <w:t>0 (DEF-01 a DEF-05 cerrados en código)</w:t>
             </w:r>
           </w:p>
         </w:tc>

</xml_diff>